<commit_message>
Title page: acknowledgements section
</commit_message>
<xml_diff>
--- a/manuscript_ipm/submission_ipm/02_Title_page.docx
+++ b/manuscript_ipm/submission_ipm/02_Title_page.docx
@@ -58,6 +58,19 @@
     <w:p>
       <w:r>
         <w:t>This research did not receive any specific grant from funding agencies in the public, commercial, or not-for-profit sectors.</w:t>
+      </w:r>
+    </w:p>
+    <w:p>
+      <w:pPr>
+        <w:pStyle w:val="Heading2"/>
+      </w:pPr>
+      <w:r>
+        <w:t>Acknowledgements</w:t>
+      </w:r>
+    </w:p>
+    <w:p>
+      <w:r>
+        <w:t>The experiments ran on free GPU sessions provided by Kaggle.</w:t>
       </w:r>
     </w:p>
     <w:p>

</xml_diff>